<commit_message>
Ground Section 13 figure narration in actual bins and preserve audience-specific facts
</commit_message>
<xml_diff>
--- a/training/section-13/communication-packet/output/汇报与传播文字示例.docx
+++ b/training/section-13/communication-packet/output/汇报与传播文字示例.docx
@@ -355,6 +355,116 @@
         <w:t>ResearchGate版权说明 https://help.researchgate.net/copyright/copyright-and-researchgate</w:t>
       </w:r>
     </w:p>
+    <w:p>
+      <w:pPr>
+        <w:wordWrap w:val="0"/>
+      </w:pPr>
+      <w:r>
+        <w:br w:type="page"/>
+      </w:r>
+    </w:p>
+    <w:p>
+      <w:pPr>
+        <w:pStyle w:val="Heading1"/>
+        <w:wordWrap w:val="0"/>
+      </w:pPr>
+      <w:r>
+        <w:t>企鹅鳍长分布图的讲述示例</w:t>
+      </w:r>
+    </w:p>
+    <w:p>
+      <w:pPr>
+        <w:wordWrap w:val="0"/>
+      </w:pPr>
+      <w:r>
+        <w:t>对应课件第4页，按坐标、具体区间、均值和解释范围依次讲解。以下为教学讲稿，尚未计时彩排。预设问答与字段定位另见图表讲述稿.md。</w:t>
+      </w:r>
+    </w:p>
+    <w:p>
+      <w:pPr>
+        <w:pStyle w:val="Heading2"/>
+        <w:wordWrap w:val="0"/>
+      </w:pPr>
+      <w:r>
+        <w:t>先说明比较对象和坐标</w:t>
+      </w:r>
+    </w:p>
+    <w:p>
+      <w:pPr>
+        <w:wordWrap w:val="0"/>
+      </w:pPr>
+      <w:r>
+        <w:t>这张图比较的是公开数据中Adelie企鹅的鳍状翼长度。我们保留了性别和鳍长都有记录的146条资料，雌雄各73条。横轴每一格表示5毫米的长度区间，纵轴表示落入这一格的记录数。这里的73是记录数，是否对应73个独立个体还要核对原始采样资料。</w:t>
+      </w:r>
+    </w:p>
+    <w:p>
+      <w:pPr>
+        <w:pStyle w:val="Heading2"/>
+        <w:wordWrap w:val="0"/>
+      </w:pPr>
+      <w:r>
+        <w:t>选一档读给听众看</w:t>
+      </w:r>
+    </w:p>
+    <w:p>
+      <w:pPr>
+        <w:wordWrap w:val="0"/>
+      </w:pPr>
+      <w:r>
+        <w:t>看190到195毫米这一档，蓝色柱是雌性21条，绿色柱是雄性24条。这个区间包括190毫米，不包括195毫米；195毫米的记录放进下一档。同一个长度区间里两组都有记录，说明两组分布存在重叠。</w:t>
+      </w:r>
+    </w:p>
+    <w:p>
+      <w:pPr>
+        <w:pStyle w:val="Heading2"/>
+        <w:wordWrap w:val="0"/>
+      </w:pPr>
+      <w:r>
+        <w:t>把均值差说完整</w:t>
+      </w:r>
+    </w:p>
+    <w:p>
+      <w:pPr>
+        <w:wordWrap w:val="0"/>
+      </w:pPr>
+      <w:r>
+        <w:t>雌性的平均鳍长为187.79毫米，雄性为192.41毫米，雄性平均高4.62毫米，约等于0.46厘米。这里比较的是两组平均值，不能据此判断任意一只雄性的鳍长都高于任意一只雌性。图中的分布重叠能帮助听众理解这句话。</w:t>
+      </w:r>
+    </w:p>
+    <w:p>
+      <w:pPr>
+        <w:pStyle w:val="Heading2"/>
+        <w:wordWrap w:val="0"/>
+      </w:pPr>
+      <w:r>
+        <w:t>解释结果能回答到哪里</w:t>
+      </w:r>
+    </w:p>
+    <w:p>
+      <w:pPr>
+        <w:wordWrap w:val="0"/>
+      </w:pPr>
+      <w:r>
+        <w:t>这些数字描述本次筛选后的记录。这次比较没有测量游泳速度，也没有检验性别影响鳍长的因果机制。个体重复和采样依赖尚待核对，因此我们先保留描述，不据此说明所有Adelie企鹅都存在同样大小的差异。原始采集来自公开研究项目，本课程完成的是二次计算。</w:t>
+      </w:r>
+    </w:p>
+    <w:p>
+      <w:pPr>
+        <w:pStyle w:val="Heading2"/>
+        <w:wordWrap w:val="0"/>
+      </w:pPr>
+      <w:r>
+        <w:t>数字定位</w:t>
+      </w:r>
+    </w:p>
+    <w:p>
+      <w:pPr>
+        <w:wordWrap w:val="0"/>
+      </w:pPr>
+      <w:r>
+        <w:t>190至195毫米对应facts.json中histogram.edges第5、第6个值，雌雄频数分别对应counts.female与counts.male第5项（从1计数）。均值差由difference_mm保存，毫米换厘米除以10，显示两位小数。</w:t>
+      </w:r>
+    </w:p>
     <w:sectPr>
       <w:pgSz w:w="12240" w:h="15840"/>
       <w:pgMar w:top="1020" w:right="1134" w:bottom="1020" w:left="1134" w:header="720" w:footer="720" w:gutter="0"/>
@@ -1085,7 +1195,7 @@
       <w:color w:val="000000"/>
       <w:spacing w:val="5"/>
       <w:kern w:val="28"/>
-      <w:sz w:val="42"/>
+      <w:sz w:val="36"/>
       <w:szCs w:val="52"/>
     </w:rPr>
   </w:style>

</xml_diff>